<commit_message>
completed questions 8-10 on word
</commit_message>
<xml_diff>
--- a/CSCI 271 Project 4 Questions.docx
+++ b/CSCI 271 Project 4 Questions.docx
@@ -38,15 +38,1009 @@
       <w:r>
         <w:t xml:space="preserve">8. </w:t>
       </w:r>
+      <w:r>
+        <w:t>The “</w:t>
+      </w:r>
+      <w:proofErr w:type="spellStart"/>
+      <w:r>
+        <w:t>addAt</w:t>
+      </w:r>
+      <w:proofErr w:type="spellEnd"/>
+      <w:r>
+        <w:t>” method has the following runtime complexities:</w:t>
+      </w:r>
     </w:p>
     <w:p>
       <w:r>
-        <w:t>9.</w:t>
+        <w:rPr>
+          <w:b/>
+          <w:bCs/>
+        </w:rPr>
+        <w:t>Worst Case</w:t>
+      </w:r>
+      <w:r>
+        <w:t>: O(n) – When it is adding at the end of the list (index = size part of the code</w:t>
+      </w:r>
+      <w:proofErr w:type="gramStart"/>
+      <w:r>
+        <w:t>),  the</w:t>
+      </w:r>
+      <w:proofErr w:type="gramEnd"/>
+      <w:r>
+        <w:t xml:space="preserve"> while loop traverses through all n nodes to find the position just before the insertion point.</w:t>
       </w:r>
     </w:p>
     <w:p>
       <w:r>
+        <w:rPr>
+          <w:b/>
+          <w:bCs/>
+        </w:rPr>
+        <w:t>Average Case</w:t>
+      </w:r>
+      <w:r>
+        <w:t xml:space="preserve">: O(n) – On average, we traverse through half of the list to find the insertion point, which is O(n/2) which = O(n). </w:t>
+      </w:r>
+    </w:p>
+    <w:p>
+      <w:r>
+        <w:rPr>
+          <w:b/>
+          <w:bCs/>
+        </w:rPr>
+        <w:t>B</w:t>
+      </w:r>
+      <w:r>
+        <w:rPr>
+          <w:b/>
+          <w:bCs/>
+        </w:rPr>
+        <w:t>est</w:t>
+      </w:r>
+      <w:r>
+        <w:rPr>
+          <w:b/>
+          <w:bCs/>
+        </w:rPr>
+        <w:t xml:space="preserve"> Case</w:t>
+      </w:r>
+      <w:r>
+        <w:t xml:space="preserve">: </w:t>
+      </w:r>
+      <w:proofErr w:type="gramStart"/>
+      <w:r>
+        <w:t>O(</w:t>
+      </w:r>
+      <w:proofErr w:type="gramEnd"/>
+      <w:r>
+        <w:t>1) – When adding at index 0 (front of the list), the method simply links the new node to the head without using any traversal.</w:t>
+      </w:r>
+    </w:p>
+    <w:p/>
+    <w:p>
+      <w:r>
+        <w:t xml:space="preserve">Some obvious performance issues I observed were: </w:t>
+      </w:r>
+    </w:p>
+    <w:p>
+      <w:r>
+        <w:t>The method calls “</w:t>
+      </w:r>
+      <w:proofErr w:type="gramStart"/>
+      <w:r>
+        <w:t>size(</w:t>
+      </w:r>
+      <w:proofErr w:type="gramEnd"/>
+      <w:r>
+        <w:t>)” at the beginning to validate the index, which itself is O(n). This means that every “</w:t>
+      </w:r>
+      <w:proofErr w:type="spellStart"/>
+      <w:r>
+        <w:t>addAt</w:t>
+      </w:r>
+      <w:proofErr w:type="spellEnd"/>
+      <w:r>
+        <w:t xml:space="preserve">” operation </w:t>
+      </w:r>
+      <w:proofErr w:type="gramStart"/>
+      <w:r>
+        <w:t>actually traverses</w:t>
+      </w:r>
+      <w:proofErr w:type="gramEnd"/>
+      <w:r>
+        <w:t xml:space="preserve"> through </w:t>
+      </w:r>
+      <w:proofErr w:type="spellStart"/>
+      <w:r>
+        <w:t>thre</w:t>
+      </w:r>
+      <w:proofErr w:type="spellEnd"/>
+      <w:r>
+        <w:t xml:space="preserve"> list twice. (Once for size validation, and once for finding the insertion point)</w:t>
+      </w:r>
+    </w:p>
+    <w:p>
+      <w:r>
+        <w:t xml:space="preserve">When adding at the end, we traverse through the entire list twice, making it 2n operations. </w:t>
+      </w:r>
+    </w:p>
+    <w:p/>
+    <w:p>
+      <w:r>
+        <w:t>9.</w:t>
+      </w:r>
+      <w:r>
+        <w:t xml:space="preserve"> </w:t>
+      </w:r>
+      <w:r>
+        <w:t>A performance improvement that I can suggest is:</w:t>
+      </w:r>
+    </w:p>
+    <w:p>
+      <w:r>
+        <w:t>Keeping a tail pointer in the List class that ALWAYS points to the last node. In theory, this should “</w:t>
+      </w:r>
+      <w:proofErr w:type="spellStart"/>
+      <w:r>
+        <w:t>addLast</w:t>
+      </w:r>
+      <w:proofErr w:type="spellEnd"/>
+      <w:r>
+        <w:t xml:space="preserve">” operations </w:t>
+      </w:r>
+      <w:proofErr w:type="gramStart"/>
+      <w:r>
+        <w:t>O(</w:t>
+      </w:r>
+      <w:proofErr w:type="gramEnd"/>
+      <w:r>
+        <w:t>1) instead of O(n).</w:t>
+      </w:r>
+    </w:p>
+    <w:p/>
+    <w:p>
+      <w:r>
         <w:t>10.</w:t>
+      </w:r>
+      <w:r>
+        <w:t xml:space="preserve"> </w:t>
+      </w:r>
+      <w:r>
+        <w:t xml:space="preserve">Before modifications, running the code outputs this: </w:t>
+      </w:r>
+    </w:p>
+    <w:p>
+      <w:pPr>
+        <w:rPr>
+          <w:sz w:val="20"/>
+          <w:szCs w:val="20"/>
+        </w:rPr>
+      </w:pPr>
+      <w:r>
+        <w:rPr>
+          <w:rStyle w:val="markedcontent"/>
+          <w:rFonts w:ascii="Courier New" w:hAnsi="Courier New" w:cs="Courier New"/>
+          <w:sz w:val="20"/>
+          <w:szCs w:val="20"/>
+          <w:shd w:val="clear" w:color="auto" w:fill="FFFFFF"/>
+        </w:rPr>
+        <w:t>k</w:t>
+      </w:r>
+      <w:r>
+        <w:rPr>
+          <w:rStyle w:val="markedcontent"/>
+          <w:rFonts w:ascii="Courier New" w:hAnsi="Courier New" w:cs="Courier New"/>
+          <w:sz w:val="20"/>
+          <w:szCs w:val="20"/>
+          <w:shd w:val="clear" w:color="auto" w:fill="FFFFFF"/>
+        </w:rPr>
+        <w:t>lementw@Wink10 assignment4 % ./a4.bin</w:t>
+      </w:r>
+      <w:r>
+        <w:rPr>
+          <w:rFonts w:ascii="Open Sans" w:hAnsi="Open Sans" w:cs="Open Sans"/>
+          <w:sz w:val="20"/>
+          <w:szCs w:val="20"/>
+          <w:shd w:val="clear" w:color="auto" w:fill="FFFFFF"/>
+        </w:rPr>
+        <w:br/>
+      </w:r>
+      <w:r>
+        <w:rPr>
+          <w:rStyle w:val="markedcontent"/>
+          <w:rFonts w:ascii="Courier New" w:hAnsi="Courier New" w:cs="Courier New"/>
+          <w:sz w:val="20"/>
+          <w:szCs w:val="20"/>
+          <w:shd w:val="clear" w:color="auto" w:fill="FFFFFF"/>
+        </w:rPr>
+        <w:t>____________Main Menu_____________________</w:t>
+      </w:r>
+      <w:r>
+        <w:rPr>
+          <w:rFonts w:ascii="Open Sans" w:hAnsi="Open Sans" w:cs="Open Sans"/>
+          <w:sz w:val="20"/>
+          <w:szCs w:val="20"/>
+          <w:shd w:val="clear" w:color="auto" w:fill="FFFFFF"/>
+        </w:rPr>
+        <w:br/>
+      </w:r>
+      <w:r>
+        <w:rPr>
+          <w:rStyle w:val="markedcontent"/>
+          <w:rFonts w:ascii="Courier New" w:hAnsi="Courier New" w:cs="Courier New"/>
+          <w:sz w:val="20"/>
+          <w:szCs w:val="20"/>
+          <w:shd w:val="clear" w:color="auto" w:fill="FFFFFF"/>
+        </w:rPr>
+        <w:t>select option :</w:t>
+      </w:r>
+      <w:r>
+        <w:rPr>
+          <w:rFonts w:ascii="Open Sans" w:hAnsi="Open Sans" w:cs="Open Sans"/>
+          <w:sz w:val="20"/>
+          <w:szCs w:val="20"/>
+          <w:shd w:val="clear" w:color="auto" w:fill="FFFFFF"/>
+        </w:rPr>
+        <w:br/>
+      </w:r>
+      <w:r>
+        <w:rPr>
+          <w:rStyle w:val="markedcontent"/>
+          <w:rFonts w:ascii="Courier New" w:hAnsi="Courier New" w:cs="Courier New"/>
+          <w:sz w:val="20"/>
+          <w:szCs w:val="20"/>
+          <w:shd w:val="clear" w:color="auto" w:fill="FFFFFF"/>
+        </w:rPr>
+        <w:t>1: insert back</w:t>
+      </w:r>
+      <w:r>
+        <w:rPr>
+          <w:rFonts w:ascii="Open Sans" w:hAnsi="Open Sans" w:cs="Open Sans"/>
+          <w:sz w:val="20"/>
+          <w:szCs w:val="20"/>
+          <w:shd w:val="clear" w:color="auto" w:fill="FFFFFF"/>
+        </w:rPr>
+        <w:br/>
+      </w:r>
+      <w:r>
+        <w:rPr>
+          <w:rStyle w:val="markedcontent"/>
+          <w:rFonts w:ascii="Courier New" w:hAnsi="Courier New" w:cs="Courier New"/>
+          <w:sz w:val="20"/>
+          <w:szCs w:val="20"/>
+          <w:shd w:val="clear" w:color="auto" w:fill="FFFFFF"/>
+        </w:rPr>
+        <w:t>2: insert front</w:t>
+      </w:r>
+      <w:r>
+        <w:rPr>
+          <w:rFonts w:ascii="Open Sans" w:hAnsi="Open Sans" w:cs="Open Sans"/>
+          <w:sz w:val="20"/>
+          <w:szCs w:val="20"/>
+          <w:shd w:val="clear" w:color="auto" w:fill="FFFFFF"/>
+        </w:rPr>
+        <w:br/>
+      </w:r>
+      <w:r>
+        <w:rPr>
+          <w:rStyle w:val="markedcontent"/>
+          <w:rFonts w:ascii="Courier New" w:hAnsi="Courier New" w:cs="Courier New"/>
+          <w:sz w:val="20"/>
+          <w:szCs w:val="20"/>
+          <w:shd w:val="clear" w:color="auto" w:fill="FFFFFF"/>
+        </w:rPr>
+        <w:t>3: insert at index</w:t>
+      </w:r>
+      <w:r>
+        <w:rPr>
+          <w:rFonts w:ascii="Open Sans" w:hAnsi="Open Sans" w:cs="Open Sans"/>
+          <w:sz w:val="20"/>
+          <w:szCs w:val="20"/>
+          <w:shd w:val="clear" w:color="auto" w:fill="FFFFFF"/>
+        </w:rPr>
+        <w:br/>
+      </w:r>
+      <w:r>
+        <w:rPr>
+          <w:rStyle w:val="markedcontent"/>
+          <w:rFonts w:ascii="Courier New" w:hAnsi="Courier New" w:cs="Courier New"/>
+          <w:sz w:val="20"/>
+          <w:szCs w:val="20"/>
+          <w:shd w:val="clear" w:color="auto" w:fill="FFFFFF"/>
+        </w:rPr>
+        <w:t>4: display items</w:t>
+      </w:r>
+      <w:r>
+        <w:rPr>
+          <w:rFonts w:ascii="Open Sans" w:hAnsi="Open Sans" w:cs="Open Sans"/>
+          <w:sz w:val="20"/>
+          <w:szCs w:val="20"/>
+          <w:shd w:val="clear" w:color="auto" w:fill="FFFFFF"/>
+        </w:rPr>
+        <w:br/>
+      </w:r>
+      <w:r>
+        <w:rPr>
+          <w:rStyle w:val="markedcontent"/>
+          <w:rFonts w:ascii="Courier New" w:hAnsi="Courier New" w:cs="Courier New"/>
+          <w:sz w:val="20"/>
+          <w:szCs w:val="20"/>
+          <w:shd w:val="clear" w:color="auto" w:fill="FFFFFF"/>
+        </w:rPr>
+        <w:t>5: get item at index</w:t>
+      </w:r>
+      <w:r>
+        <w:rPr>
+          <w:rFonts w:ascii="Open Sans" w:hAnsi="Open Sans" w:cs="Open Sans"/>
+          <w:sz w:val="20"/>
+          <w:szCs w:val="20"/>
+          <w:shd w:val="clear" w:color="auto" w:fill="FFFFFF"/>
+        </w:rPr>
+        <w:br/>
+      </w:r>
+      <w:r>
+        <w:rPr>
+          <w:rStyle w:val="markedcontent"/>
+          <w:rFonts w:ascii="Courier New" w:hAnsi="Courier New" w:cs="Courier New"/>
+          <w:sz w:val="20"/>
+          <w:szCs w:val="20"/>
+          <w:shd w:val="clear" w:color="auto" w:fill="FFFFFF"/>
+        </w:rPr>
+        <w:t>6: delete back</w:t>
+      </w:r>
+      <w:r>
+        <w:rPr>
+          <w:rFonts w:ascii="Open Sans" w:hAnsi="Open Sans" w:cs="Open Sans"/>
+          <w:sz w:val="20"/>
+          <w:szCs w:val="20"/>
+          <w:shd w:val="clear" w:color="auto" w:fill="FFFFFF"/>
+        </w:rPr>
+        <w:br/>
+      </w:r>
+      <w:r>
+        <w:rPr>
+          <w:rStyle w:val="markedcontent"/>
+          <w:rFonts w:ascii="Courier New" w:hAnsi="Courier New" w:cs="Courier New"/>
+          <w:sz w:val="20"/>
+          <w:szCs w:val="20"/>
+          <w:shd w:val="clear" w:color="auto" w:fill="FFFFFF"/>
+        </w:rPr>
+        <w:t>7: delete front</w:t>
+      </w:r>
+      <w:r>
+        <w:rPr>
+          <w:rFonts w:ascii="Open Sans" w:hAnsi="Open Sans" w:cs="Open Sans"/>
+          <w:sz w:val="20"/>
+          <w:szCs w:val="20"/>
+          <w:shd w:val="clear" w:color="auto" w:fill="FFFFFF"/>
+        </w:rPr>
+        <w:br/>
+      </w:r>
+      <w:r>
+        <w:rPr>
+          <w:rStyle w:val="markedcontent"/>
+          <w:rFonts w:ascii="Courier New" w:hAnsi="Courier New" w:cs="Courier New"/>
+          <w:sz w:val="20"/>
+          <w:szCs w:val="20"/>
+          <w:shd w:val="clear" w:color="auto" w:fill="FFFFFF"/>
+        </w:rPr>
+        <w:t>8: delete at index</w:t>
+      </w:r>
+      <w:r>
+        <w:rPr>
+          <w:rFonts w:ascii="Open Sans" w:hAnsi="Open Sans" w:cs="Open Sans"/>
+          <w:sz w:val="20"/>
+          <w:szCs w:val="20"/>
+          <w:shd w:val="clear" w:color="auto" w:fill="FFFFFF"/>
+        </w:rPr>
+        <w:br/>
+      </w:r>
+      <w:r>
+        <w:rPr>
+          <w:rStyle w:val="markedcontent"/>
+          <w:rFonts w:ascii="Courier New" w:hAnsi="Courier New" w:cs="Courier New"/>
+          <w:sz w:val="20"/>
+          <w:szCs w:val="20"/>
+          <w:shd w:val="clear" w:color="auto" w:fill="FFFFFF"/>
+        </w:rPr>
+        <w:lastRenderedPageBreak/>
+        <w:t>9: exit</w:t>
+      </w:r>
+      <w:r>
+        <w:rPr>
+          <w:rFonts w:ascii="Open Sans" w:hAnsi="Open Sans" w:cs="Open Sans"/>
+          <w:sz w:val="20"/>
+          <w:szCs w:val="20"/>
+          <w:shd w:val="clear" w:color="auto" w:fill="FFFFFF"/>
+        </w:rPr>
+        <w:br/>
+      </w:r>
+      <w:r>
+        <w:rPr>
+          <w:rStyle w:val="markedcontent"/>
+          <w:rFonts w:ascii="Courier New" w:hAnsi="Courier New" w:cs="Courier New"/>
+          <w:sz w:val="20"/>
+          <w:szCs w:val="20"/>
+          <w:shd w:val="clear" w:color="auto" w:fill="FFFFFF"/>
+        </w:rPr>
+        <w:t>1</w:t>
+      </w:r>
+      <w:r>
+        <w:rPr>
+          <w:rFonts w:ascii="Open Sans" w:hAnsi="Open Sans" w:cs="Open Sans"/>
+          <w:sz w:val="20"/>
+          <w:szCs w:val="20"/>
+          <w:shd w:val="clear" w:color="auto" w:fill="FFFFFF"/>
+        </w:rPr>
+        <w:br/>
+      </w:r>
+      <w:r>
+        <w:rPr>
+          <w:rStyle w:val="markedcontent"/>
+          <w:rFonts w:ascii="Courier New" w:hAnsi="Courier New" w:cs="Courier New"/>
+          <w:sz w:val="20"/>
+          <w:szCs w:val="20"/>
+          <w:shd w:val="clear" w:color="auto" w:fill="FFFFFF"/>
+        </w:rPr>
+        <w:t>enter item to insert:</w:t>
+      </w:r>
+      <w:r>
+        <w:rPr>
+          <w:rFonts w:ascii="Open Sans" w:hAnsi="Open Sans" w:cs="Open Sans"/>
+          <w:sz w:val="20"/>
+          <w:szCs w:val="20"/>
+          <w:shd w:val="clear" w:color="auto" w:fill="FFFFFF"/>
+        </w:rPr>
+        <w:br/>
+      </w:r>
+      <w:r>
+        <w:rPr>
+          <w:rStyle w:val="markedcontent"/>
+          <w:rFonts w:ascii="Courier New" w:hAnsi="Courier New" w:cs="Courier New"/>
+          <w:sz w:val="20"/>
+          <w:szCs w:val="20"/>
+          <w:shd w:val="clear" w:color="auto" w:fill="FFFFFF"/>
+        </w:rPr>
+        <w:t>2</w:t>
+      </w:r>
+      <w:r>
+        <w:rPr>
+          <w:rFonts w:ascii="Open Sans" w:hAnsi="Open Sans" w:cs="Open Sans"/>
+          <w:sz w:val="20"/>
+          <w:szCs w:val="20"/>
+          <w:shd w:val="clear" w:color="auto" w:fill="FFFFFF"/>
+        </w:rPr>
+        <w:br/>
+      </w:r>
+      <w:proofErr w:type="spellStart"/>
+      <w:r>
+        <w:rPr>
+          <w:rStyle w:val="markedcontent"/>
+          <w:rFonts w:ascii="Courier New" w:hAnsi="Courier New" w:cs="Courier New"/>
+          <w:sz w:val="20"/>
+          <w:szCs w:val="20"/>
+          <w:shd w:val="clear" w:color="auto" w:fill="FFFFFF"/>
+        </w:rPr>
+        <w:t>addLast</w:t>
+      </w:r>
+      <w:proofErr w:type="spellEnd"/>
+      <w:r>
+        <w:rPr>
+          <w:rStyle w:val="markedcontent"/>
+          <w:rFonts w:ascii="Courier New" w:hAnsi="Courier New" w:cs="Courier New"/>
+          <w:sz w:val="20"/>
+          <w:szCs w:val="20"/>
+          <w:shd w:val="clear" w:color="auto" w:fill="FFFFFF"/>
+        </w:rPr>
+        <w:t>(item): you need to write this method &lt;-------------</w:t>
+      </w:r>
+      <w:r>
+        <w:rPr>
+          <w:rFonts w:ascii="Open Sans" w:hAnsi="Open Sans" w:cs="Open Sans"/>
+          <w:sz w:val="20"/>
+          <w:szCs w:val="20"/>
+          <w:shd w:val="clear" w:color="auto" w:fill="FFFFFF"/>
+        </w:rPr>
+        <w:br/>
+      </w:r>
+      <w:r>
+        <w:rPr>
+          <w:rStyle w:val="markedcontent"/>
+          <w:rFonts w:ascii="Courier New" w:hAnsi="Courier New" w:cs="Courier New"/>
+          <w:sz w:val="20"/>
+          <w:szCs w:val="20"/>
+          <w:shd w:val="clear" w:color="auto" w:fill="FFFFFF"/>
+        </w:rPr>
+        <w:t xml:space="preserve">CPU time used: 2 </w:t>
+      </w:r>
+      <w:proofErr w:type="spellStart"/>
+      <w:r>
+        <w:rPr>
+          <w:rStyle w:val="markedcontent"/>
+          <w:rFonts w:ascii="Courier New" w:hAnsi="Courier New" w:cs="Courier New"/>
+          <w:sz w:val="20"/>
+          <w:szCs w:val="20"/>
+          <w:shd w:val="clear" w:color="auto" w:fill="FFFFFF"/>
+        </w:rPr>
+        <w:t>ms</w:t>
+      </w:r>
+      <w:proofErr w:type="spellEnd"/>
+      <w:r>
+        <w:rPr>
+          <w:rFonts w:ascii="Open Sans" w:hAnsi="Open Sans" w:cs="Open Sans"/>
+          <w:sz w:val="20"/>
+          <w:szCs w:val="20"/>
+          <w:shd w:val="clear" w:color="auto" w:fill="FFFFFF"/>
+        </w:rPr>
+        <w:br/>
+      </w:r>
+      <w:r>
+        <w:rPr>
+          <w:rStyle w:val="markedcontent"/>
+          <w:rFonts w:ascii="Courier New" w:hAnsi="Courier New" w:cs="Courier New"/>
+          <w:sz w:val="20"/>
+          <w:szCs w:val="20"/>
+          <w:shd w:val="clear" w:color="auto" w:fill="FFFFFF"/>
+        </w:rPr>
+        <w:t>____________Main Menu_____________________</w:t>
+      </w:r>
+      <w:r>
+        <w:rPr>
+          <w:rFonts w:ascii="Open Sans" w:hAnsi="Open Sans" w:cs="Open Sans"/>
+          <w:sz w:val="20"/>
+          <w:szCs w:val="20"/>
+          <w:shd w:val="clear" w:color="auto" w:fill="FFFFFF"/>
+        </w:rPr>
+        <w:br/>
+      </w:r>
+      <w:r>
+        <w:rPr>
+          <w:rStyle w:val="markedcontent"/>
+          <w:rFonts w:ascii="Courier New" w:hAnsi="Courier New" w:cs="Courier New"/>
+          <w:sz w:val="20"/>
+          <w:szCs w:val="20"/>
+          <w:shd w:val="clear" w:color="auto" w:fill="FFFFFF"/>
+        </w:rPr>
+        <w:t>select option :</w:t>
+      </w:r>
+      <w:r>
+        <w:rPr>
+          <w:rFonts w:ascii="Open Sans" w:hAnsi="Open Sans" w:cs="Open Sans"/>
+          <w:sz w:val="20"/>
+          <w:szCs w:val="20"/>
+          <w:shd w:val="clear" w:color="auto" w:fill="FFFFFF"/>
+        </w:rPr>
+        <w:br/>
+      </w:r>
+      <w:r>
+        <w:rPr>
+          <w:rStyle w:val="markedcontent"/>
+          <w:rFonts w:ascii="Courier New" w:hAnsi="Courier New" w:cs="Courier New"/>
+          <w:sz w:val="20"/>
+          <w:szCs w:val="20"/>
+          <w:shd w:val="clear" w:color="auto" w:fill="FFFFFF"/>
+        </w:rPr>
+        <w:t>1: insert back</w:t>
+      </w:r>
+      <w:r>
+        <w:rPr>
+          <w:rFonts w:ascii="Open Sans" w:hAnsi="Open Sans" w:cs="Open Sans"/>
+          <w:sz w:val="20"/>
+          <w:szCs w:val="20"/>
+          <w:shd w:val="clear" w:color="auto" w:fill="FFFFFF"/>
+        </w:rPr>
+        <w:br/>
+      </w:r>
+      <w:r>
+        <w:rPr>
+          <w:rStyle w:val="markedcontent"/>
+          <w:rFonts w:ascii="Courier New" w:hAnsi="Courier New" w:cs="Courier New"/>
+          <w:sz w:val="20"/>
+          <w:szCs w:val="20"/>
+          <w:shd w:val="clear" w:color="auto" w:fill="FFFFFF"/>
+        </w:rPr>
+        <w:t>2: insert front</w:t>
+      </w:r>
+      <w:r>
+        <w:rPr>
+          <w:rFonts w:ascii="Open Sans" w:hAnsi="Open Sans" w:cs="Open Sans"/>
+          <w:sz w:val="20"/>
+          <w:szCs w:val="20"/>
+          <w:shd w:val="clear" w:color="auto" w:fill="FFFFFF"/>
+        </w:rPr>
+        <w:br/>
+      </w:r>
+      <w:r>
+        <w:rPr>
+          <w:rStyle w:val="markedcontent"/>
+          <w:rFonts w:ascii="Courier New" w:hAnsi="Courier New" w:cs="Courier New"/>
+          <w:sz w:val="20"/>
+          <w:szCs w:val="20"/>
+          <w:shd w:val="clear" w:color="auto" w:fill="FFFFFF"/>
+        </w:rPr>
+        <w:t>3: insert at index</w:t>
+      </w:r>
+      <w:r>
+        <w:rPr>
+          <w:rFonts w:ascii="Open Sans" w:hAnsi="Open Sans" w:cs="Open Sans"/>
+          <w:sz w:val="20"/>
+          <w:szCs w:val="20"/>
+          <w:shd w:val="clear" w:color="auto" w:fill="FFFFFF"/>
+        </w:rPr>
+        <w:br/>
+      </w:r>
+      <w:r>
+        <w:rPr>
+          <w:rStyle w:val="markedcontent"/>
+          <w:rFonts w:ascii="Courier New" w:hAnsi="Courier New" w:cs="Courier New"/>
+          <w:sz w:val="20"/>
+          <w:szCs w:val="20"/>
+          <w:shd w:val="clear" w:color="auto" w:fill="FFFFFF"/>
+        </w:rPr>
+        <w:t>4: display items</w:t>
+      </w:r>
+      <w:r>
+        <w:rPr>
+          <w:rFonts w:ascii="Open Sans" w:hAnsi="Open Sans" w:cs="Open Sans"/>
+          <w:sz w:val="20"/>
+          <w:szCs w:val="20"/>
+          <w:shd w:val="clear" w:color="auto" w:fill="FFFFFF"/>
+        </w:rPr>
+        <w:br/>
+      </w:r>
+      <w:r>
+        <w:rPr>
+          <w:rStyle w:val="markedcontent"/>
+          <w:rFonts w:ascii="Courier New" w:hAnsi="Courier New" w:cs="Courier New"/>
+          <w:sz w:val="20"/>
+          <w:szCs w:val="20"/>
+          <w:shd w:val="clear" w:color="auto" w:fill="FFFFFF"/>
+        </w:rPr>
+        <w:t>5: get item at index</w:t>
+      </w:r>
+      <w:r>
+        <w:rPr>
+          <w:rFonts w:ascii="Open Sans" w:hAnsi="Open Sans" w:cs="Open Sans"/>
+          <w:sz w:val="20"/>
+          <w:szCs w:val="20"/>
+          <w:shd w:val="clear" w:color="auto" w:fill="FFFFFF"/>
+        </w:rPr>
+        <w:br/>
+      </w:r>
+      <w:r>
+        <w:rPr>
+          <w:rStyle w:val="markedcontent"/>
+          <w:rFonts w:ascii="Courier New" w:hAnsi="Courier New" w:cs="Courier New"/>
+          <w:sz w:val="20"/>
+          <w:szCs w:val="20"/>
+          <w:shd w:val="clear" w:color="auto" w:fill="FFFFFF"/>
+        </w:rPr>
+        <w:t>6: delete back</w:t>
+      </w:r>
+      <w:r>
+        <w:rPr>
+          <w:rFonts w:ascii="Open Sans" w:hAnsi="Open Sans" w:cs="Open Sans"/>
+          <w:sz w:val="20"/>
+          <w:szCs w:val="20"/>
+          <w:shd w:val="clear" w:color="auto" w:fill="FFFFFF"/>
+        </w:rPr>
+        <w:br/>
+      </w:r>
+      <w:r>
+        <w:rPr>
+          <w:rStyle w:val="markedcontent"/>
+          <w:rFonts w:ascii="Courier New" w:hAnsi="Courier New" w:cs="Courier New"/>
+          <w:sz w:val="20"/>
+          <w:szCs w:val="20"/>
+          <w:shd w:val="clear" w:color="auto" w:fill="FFFFFF"/>
+        </w:rPr>
+        <w:t>7: delete front</w:t>
+      </w:r>
+      <w:r>
+        <w:rPr>
+          <w:rFonts w:ascii="Open Sans" w:hAnsi="Open Sans" w:cs="Open Sans"/>
+          <w:sz w:val="20"/>
+          <w:szCs w:val="20"/>
+          <w:shd w:val="clear" w:color="auto" w:fill="FFFFFF"/>
+        </w:rPr>
+        <w:br/>
+      </w:r>
+      <w:r>
+        <w:rPr>
+          <w:rStyle w:val="markedcontent"/>
+          <w:rFonts w:ascii="Courier New" w:hAnsi="Courier New" w:cs="Courier New"/>
+          <w:sz w:val="20"/>
+          <w:szCs w:val="20"/>
+          <w:shd w:val="clear" w:color="auto" w:fill="FFFFFF"/>
+        </w:rPr>
+        <w:t>8: delete at index</w:t>
+      </w:r>
+      <w:r>
+        <w:rPr>
+          <w:rFonts w:ascii="Open Sans" w:hAnsi="Open Sans" w:cs="Open Sans"/>
+          <w:sz w:val="20"/>
+          <w:szCs w:val="20"/>
+          <w:shd w:val="clear" w:color="auto" w:fill="FFFFFF"/>
+        </w:rPr>
+        <w:br/>
+      </w:r>
+      <w:r>
+        <w:rPr>
+          <w:rStyle w:val="markedcontent"/>
+          <w:rFonts w:ascii="Courier New" w:hAnsi="Courier New" w:cs="Courier New"/>
+          <w:sz w:val="20"/>
+          <w:szCs w:val="20"/>
+          <w:shd w:val="clear" w:color="auto" w:fill="FFFFFF"/>
+        </w:rPr>
+        <w:t>9: exit</w:t>
+      </w:r>
+      <w:r>
+        <w:rPr>
+          <w:rFonts w:ascii="Open Sans" w:hAnsi="Open Sans" w:cs="Open Sans"/>
+          <w:sz w:val="20"/>
+          <w:szCs w:val="20"/>
+          <w:shd w:val="clear" w:color="auto" w:fill="FFFFFF"/>
+        </w:rPr>
+        <w:br/>
+      </w:r>
+      <w:r>
+        <w:rPr>
+          <w:rStyle w:val="markedcontent"/>
+          <w:rFonts w:ascii="Courier New" w:hAnsi="Courier New" w:cs="Courier New"/>
+          <w:sz w:val="20"/>
+          <w:szCs w:val="20"/>
+          <w:shd w:val="clear" w:color="auto" w:fill="FFFFFF"/>
+        </w:rPr>
+        <w:t>9</w:t>
+      </w:r>
+      <w:r>
+        <w:rPr>
+          <w:rFonts w:ascii="Open Sans" w:hAnsi="Open Sans" w:cs="Open Sans"/>
+          <w:sz w:val="20"/>
+          <w:szCs w:val="20"/>
+          <w:shd w:val="clear" w:color="auto" w:fill="FFFFFF"/>
+        </w:rPr>
+        <w:br/>
+      </w:r>
+      <w:r>
+        <w:rPr>
+          <w:rStyle w:val="markedcontent"/>
+          <w:rFonts w:ascii="Courier New" w:hAnsi="Courier New" w:cs="Courier New"/>
+          <w:sz w:val="20"/>
+          <w:szCs w:val="20"/>
+          <w:shd w:val="clear" w:color="auto" w:fill="FFFFFF"/>
+        </w:rPr>
+        <w:t xml:space="preserve">CPU time used: 6 </w:t>
+      </w:r>
+      <w:proofErr w:type="spellStart"/>
+      <w:r>
+        <w:rPr>
+          <w:rStyle w:val="markedcontent"/>
+          <w:rFonts w:ascii="Courier New" w:hAnsi="Courier New" w:cs="Courier New"/>
+          <w:sz w:val="20"/>
+          <w:szCs w:val="20"/>
+          <w:shd w:val="clear" w:color="auto" w:fill="FFFFFF"/>
+        </w:rPr>
+        <w:t>ms</w:t>
+      </w:r>
+      <w:proofErr w:type="spellEnd"/>
+      <w:r>
+        <w:rPr>
+          <w:rFonts w:ascii="Open Sans" w:hAnsi="Open Sans" w:cs="Open Sans"/>
+          <w:sz w:val="20"/>
+          <w:szCs w:val="20"/>
+          <w:shd w:val="clear" w:color="auto" w:fill="FFFFFF"/>
+        </w:rPr>
+        <w:br/>
+      </w:r>
+      <w:r>
+        <w:rPr>
+          <w:rStyle w:val="markedcontent"/>
+          <w:rFonts w:ascii="Courier New" w:hAnsi="Courier New" w:cs="Courier New"/>
+          <w:sz w:val="20"/>
+          <w:szCs w:val="20"/>
+          <w:shd w:val="clear" w:color="auto" w:fill="FFFFFF"/>
+        </w:rPr>
+        <w:t>~List(): you need to write this method &lt;-------------</w:t>
+      </w:r>
+      <w:r>
+        <w:rPr>
+          <w:rFonts w:ascii="Open Sans" w:hAnsi="Open Sans" w:cs="Open Sans"/>
+          <w:sz w:val="20"/>
+          <w:szCs w:val="20"/>
+          <w:shd w:val="clear" w:color="auto" w:fill="FFFFFF"/>
+        </w:rPr>
+        <w:br/>
+      </w:r>
+      <w:r>
+        <w:rPr>
+          <w:rStyle w:val="markedcontent"/>
+          <w:rFonts w:ascii="Courier New" w:hAnsi="Courier New" w:cs="Courier New"/>
+          <w:sz w:val="20"/>
+          <w:szCs w:val="20"/>
+          <w:shd w:val="clear" w:color="auto" w:fill="FFFFFF"/>
+        </w:rPr>
+        <w:t>..........................................</w:t>
+      </w:r>
+      <w:r>
+        <w:rPr>
+          <w:rFonts w:ascii="Open Sans" w:hAnsi="Open Sans" w:cs="Open Sans"/>
+          <w:sz w:val="20"/>
+          <w:szCs w:val="20"/>
+          <w:shd w:val="clear" w:color="auto" w:fill="FFFFFF"/>
+        </w:rPr>
+        <w:br/>
+      </w:r>
+      <w:r>
+        <w:rPr>
+          <w:rStyle w:val="markedcontent"/>
+          <w:rFonts w:ascii="Courier New" w:hAnsi="Courier New" w:cs="Courier New"/>
+          <w:sz w:val="20"/>
+          <w:szCs w:val="20"/>
+          <w:shd w:val="clear" w:color="auto" w:fill="FFFFFF"/>
+        </w:rPr>
+        <w:t>........ CONGRATULATIONS on memory well managed! .... :^) !!!!</w:t>
+      </w:r>
+      <w:r>
+        <w:rPr>
+          <w:rFonts w:ascii="Open Sans" w:hAnsi="Open Sans" w:cs="Open Sans"/>
+          <w:sz w:val="20"/>
+          <w:szCs w:val="20"/>
+          <w:shd w:val="clear" w:color="auto" w:fill="FFFFFF"/>
+        </w:rPr>
+        <w:br/>
+      </w:r>
+      <w:r>
+        <w:rPr>
+          <w:rStyle w:val="markedcontent"/>
+          <w:rFonts w:ascii="Courier New" w:hAnsi="Courier New" w:cs="Courier New"/>
+          <w:sz w:val="20"/>
+          <w:szCs w:val="20"/>
+          <w:shd w:val="clear" w:color="auto" w:fill="FFFFFF"/>
+        </w:rPr>
+        <w:t>Allocation Calls: 1</w:t>
+      </w:r>
+      <w:r>
+        <w:rPr>
+          <w:rFonts w:ascii="Open Sans" w:hAnsi="Open Sans" w:cs="Open Sans"/>
+          <w:sz w:val="20"/>
+          <w:szCs w:val="20"/>
+          <w:shd w:val="clear" w:color="auto" w:fill="FFFFFF"/>
+        </w:rPr>
+        <w:br/>
+      </w:r>
+      <w:proofErr w:type="spellStart"/>
+      <w:r>
+        <w:rPr>
+          <w:rStyle w:val="markedcontent"/>
+          <w:rFonts w:ascii="Courier New" w:hAnsi="Courier New" w:cs="Courier New"/>
+          <w:sz w:val="20"/>
+          <w:szCs w:val="20"/>
+          <w:shd w:val="clear" w:color="auto" w:fill="FFFFFF"/>
+        </w:rPr>
+        <w:t>DeAllocation</w:t>
+      </w:r>
+      <w:proofErr w:type="spellEnd"/>
+      <w:r>
+        <w:rPr>
+          <w:rStyle w:val="markedcontent"/>
+          <w:rFonts w:ascii="Courier New" w:hAnsi="Courier New" w:cs="Courier New"/>
+          <w:sz w:val="20"/>
+          <w:szCs w:val="20"/>
+          <w:shd w:val="clear" w:color="auto" w:fill="FFFFFF"/>
+        </w:rPr>
+        <w:t xml:space="preserve"> Calls: 1</w:t>
+      </w:r>
+      <w:r>
+        <w:rPr>
+          <w:rFonts w:ascii="Open Sans" w:hAnsi="Open Sans" w:cs="Open Sans"/>
+          <w:sz w:val="20"/>
+          <w:szCs w:val="20"/>
+          <w:shd w:val="clear" w:color="auto" w:fill="FFFFFF"/>
+        </w:rPr>
+        <w:br/>
+      </w:r>
+      <w:r>
+        <w:rPr>
+          <w:rStyle w:val="markedcontent"/>
+          <w:rFonts w:ascii="Courier New" w:hAnsi="Courier New" w:cs="Courier New"/>
+          <w:sz w:val="20"/>
+          <w:szCs w:val="20"/>
+          <w:shd w:val="clear" w:color="auto" w:fill="FFFFFF"/>
+        </w:rPr>
+        <w:t>~</w:t>
+      </w:r>
+      <w:proofErr w:type="gramStart"/>
+      <w:r>
+        <w:rPr>
+          <w:rStyle w:val="markedcontent"/>
+          <w:rFonts w:ascii="Courier New" w:hAnsi="Courier New" w:cs="Courier New"/>
+          <w:sz w:val="20"/>
+          <w:szCs w:val="20"/>
+          <w:shd w:val="clear" w:color="auto" w:fill="FFFFFF"/>
+        </w:rPr>
+        <w:t>List(</w:t>
+      </w:r>
+      <w:proofErr w:type="gramEnd"/>
+      <w:r>
+        <w:rPr>
+          <w:rStyle w:val="markedcontent"/>
+          <w:rFonts w:ascii="Courier New" w:hAnsi="Courier New" w:cs="Courier New"/>
+          <w:sz w:val="20"/>
+          <w:szCs w:val="20"/>
+          <w:shd w:val="clear" w:color="auto" w:fill="FFFFFF"/>
+        </w:rPr>
+        <w:t>): you need to write this method &lt;-------------</w:t>
+      </w:r>
+      <w:r>
+        <w:rPr>
+          <w:rFonts w:ascii="Open Sans" w:hAnsi="Open Sans" w:cs="Open Sans"/>
+          <w:sz w:val="20"/>
+          <w:szCs w:val="20"/>
+          <w:shd w:val="clear" w:color="auto" w:fill="FFFFFF"/>
+        </w:rPr>
+        <w:br/>
+      </w:r>
+      <w:r>
+        <w:rPr>
+          <w:rStyle w:val="markedcontent"/>
+          <w:rFonts w:ascii="Courier New" w:hAnsi="Courier New" w:cs="Courier New"/>
+          <w:sz w:val="20"/>
+          <w:szCs w:val="20"/>
+          <w:shd w:val="clear" w:color="auto" w:fill="FFFFFF"/>
+        </w:rPr>
+        <w:t>klementw@Wink10 assignment4 %</w:t>
+      </w:r>
+    </w:p>
+    <w:p/>
+    <w:p>
+      <w:r>
+        <w:t>In the output, why were there two calls to “~</w:t>
+      </w:r>
+      <w:proofErr w:type="gramStart"/>
+      <w:r>
+        <w:t>list(</w:t>
+      </w:r>
+      <w:proofErr w:type="gramEnd"/>
+      <w:r>
+        <w:t>)”?</w:t>
+      </w:r>
+    </w:p>
+    <w:p>
+      <w:r>
+        <w:rPr>
+          <w:b/>
+          <w:bCs/>
+        </w:rPr>
+        <w:t>First call</w:t>
+      </w:r>
+      <w:r>
+        <w:t>: Whenever a user selects option 9 to exit the program, the program explicitly calls “</w:t>
+      </w:r>
+      <w:proofErr w:type="spellStart"/>
+      <w:proofErr w:type="gramStart"/>
+      <w:r>
+        <w:t>list.~List</w:t>
+      </w:r>
+      <w:proofErr w:type="spellEnd"/>
+      <w:r>
+        <w:t>(</w:t>
+      </w:r>
+      <w:proofErr w:type="gramEnd"/>
+      <w:r>
+        <w:t>)” at the end of the main function. This is a manual destructor call to avoid memory leaks.</w:t>
+      </w:r>
+    </w:p>
+    <w:p>
+      <w:r>
+        <w:rPr>
+          <w:b/>
+          <w:bCs/>
+        </w:rPr>
+        <w:t>Second call</w:t>
+      </w:r>
+      <w:r>
+        <w:t xml:space="preserve">: After the manual destructor call and after displaying the memory stats, when the main function returns, the list object goes out of the scope, which triggers the destructor again. </w:t>
       </w:r>
     </w:p>
     <w:sectPr>
@@ -976,6 +1970,11 @@
       <w:spacing w:val="5"/>
     </w:rPr>
   </w:style>
+  <w:style w:type="character" w:customStyle="1" w:styleId="markedcontent">
+    <w:name w:val="markedcontent"/>
+    <w:basedOn w:val="DefaultParagraphFont"/>
+    <w:rsid w:val="004712A1"/>
+  </w:style>
 </w:styles>
 </file>
 

</xml_diff>